<commit_message>
fix: auth session in middleware, audit dates, Gemini campaign cache and parsing
- auth.config: session callback for Edge + explicit role checks (admin redirect loop)
- audit-before-after: safe createdAt for client JSON (string or Date)
- campaign ideas: DB daily cache per focus, forceRefresh + UI; structured JSON schema + parse fallbacks
- docx generators: DXA table widths for Pages/Word; plain-text guides in docs/client-guide/txt
- prisma: CampaignIdeaDailyCache; probe:gemini-campaign script

Made-with: Cursor
</commit_message>
<xml_diff>
--- a/docs/client-guide/Client-Product-Guide.docx
+++ b/docs/client-guide/Client-Product-Guide.docx
@@ -82,7 +82,7 @@
     </w:p>
     <w:tbl>
       <w:tblPr>
-        <w:tblW w:type="pct" w:w="100%"/>
+        <w:tblW w:type="dxa" w:w="9360"/>
         <w:tblBorders>
           <w:top w:val="single" w:color="auto" w:sz="4"/>
           <w:left w:val="single" w:color="auto" w:sz="4"/>
@@ -101,7 +101,7 @@
       <w:tr>
         <w:tc>
           <w:tcPr>
-            <w:tcW w:type="pct" w:w="22%"/>
+            <w:tcW w:type="dxa" w:w="2340"/>
             <w:tcBorders>
               <w:top w:val="single" w:color="CCCCCC" w:sz="1"/>
               <w:left w:val="single" w:color="CCCCCC" w:sz="1"/>
@@ -123,7 +123,7 @@
         </w:tc>
         <w:tc>
           <w:tcPr>
-            <w:tcW w:type="pct" w:w="22%"/>
+            <w:tcW w:type="dxa" w:w="2340"/>
             <w:tcBorders>
               <w:top w:val="single" w:color="CCCCCC" w:sz="1"/>
               <w:left w:val="single" w:color="CCCCCC" w:sz="1"/>
@@ -145,7 +145,7 @@
         </w:tc>
         <w:tc>
           <w:tcPr>
-            <w:tcW w:type="pct" w:w="22%"/>
+            <w:tcW w:type="dxa" w:w="2340"/>
             <w:tcBorders>
               <w:top w:val="single" w:color="CCCCCC" w:sz="1"/>
               <w:left w:val="single" w:color="CCCCCC" w:sz="1"/>
@@ -167,7 +167,7 @@
         </w:tc>
         <w:tc>
           <w:tcPr>
-            <w:tcW w:type="pct" w:w="22%"/>
+            <w:tcW w:type="dxa" w:w="2340"/>
             <w:tcBorders>
               <w:top w:val="single" w:color="CCCCCC" w:sz="1"/>
               <w:left w:val="single" w:color="CCCCCC" w:sz="1"/>
@@ -191,7 +191,7 @@
       <w:tr>
         <w:tc>
           <w:tcPr>
-            <w:tcW w:type="pct" w:w="22%"/>
+            <w:tcW w:type="dxa" w:w="2340"/>
             <w:tcBorders>
               <w:top w:val="single" w:color="CCCCCC" w:sz="1"/>
               <w:left w:val="single" w:color="CCCCCC" w:sz="1"/>
@@ -213,51 +213,51 @@
         </w:tc>
         <w:tc>
           <w:tcPr>
-            <w:tcW w:type="pct" w:w="22%"/>
-            <w:tcBorders>
-              <w:top w:val="single" w:color="CCCCCC" w:sz="1"/>
-              <w:left w:val="single" w:color="CCCCCC" w:sz="1"/>
-              <w:bottom w:val="single" w:color="CCCCCC" w:sz="1"/>
-              <w:right w:val="single" w:color="CCCCCC" w:sz="1"/>
-            </w:tcBorders>
-          </w:tcPr>
-          <w:p>
-            <w:r>
-              <w:rPr>
-                <w:b w:val="false"/>
-                <w:bCs w:val="false"/>
-                <w:sz w:val="20"/>
-                <w:szCs w:val="20"/>
-              </w:rPr>
-              <w:t xml:space="preserve">Yes</w:t>
-            </w:r>
-          </w:p>
-        </w:tc>
-        <w:tc>
-          <w:tcPr>
-            <w:tcW w:type="pct" w:w="22%"/>
-            <w:tcBorders>
-              <w:top w:val="single" w:color="CCCCCC" w:sz="1"/>
-              <w:left w:val="single" w:color="CCCCCC" w:sz="1"/>
-              <w:bottom w:val="single" w:color="CCCCCC" w:sz="1"/>
-              <w:right w:val="single" w:color="CCCCCC" w:sz="1"/>
-            </w:tcBorders>
-          </w:tcPr>
-          <w:p>
-            <w:r>
-              <w:rPr>
-                <w:b w:val="false"/>
-                <w:bCs w:val="false"/>
-                <w:sz w:val="20"/>
-                <w:szCs w:val="20"/>
-              </w:rPr>
-              <w:t xml:space="preserve">Yes</w:t>
-            </w:r>
-          </w:p>
-        </w:tc>
-        <w:tc>
-          <w:tcPr>
-            <w:tcW w:type="pct" w:w="22%"/>
+            <w:tcW w:type="dxa" w:w="2340"/>
+            <w:tcBorders>
+              <w:top w:val="single" w:color="CCCCCC" w:sz="1"/>
+              <w:left w:val="single" w:color="CCCCCC" w:sz="1"/>
+              <w:bottom w:val="single" w:color="CCCCCC" w:sz="1"/>
+              <w:right w:val="single" w:color="CCCCCC" w:sz="1"/>
+            </w:tcBorders>
+          </w:tcPr>
+          <w:p>
+            <w:r>
+              <w:rPr>
+                <w:b w:val="false"/>
+                <w:bCs w:val="false"/>
+                <w:sz w:val="20"/>
+                <w:szCs w:val="20"/>
+              </w:rPr>
+              <w:t xml:space="preserve">Yes</w:t>
+            </w:r>
+          </w:p>
+        </w:tc>
+        <w:tc>
+          <w:tcPr>
+            <w:tcW w:type="dxa" w:w="2340"/>
+            <w:tcBorders>
+              <w:top w:val="single" w:color="CCCCCC" w:sz="1"/>
+              <w:left w:val="single" w:color="CCCCCC" w:sz="1"/>
+              <w:bottom w:val="single" w:color="CCCCCC" w:sz="1"/>
+              <w:right w:val="single" w:color="CCCCCC" w:sz="1"/>
+            </w:tcBorders>
+          </w:tcPr>
+          <w:p>
+            <w:r>
+              <w:rPr>
+                <w:b w:val="false"/>
+                <w:bCs w:val="false"/>
+                <w:sz w:val="20"/>
+                <w:szCs w:val="20"/>
+              </w:rPr>
+              <w:t xml:space="preserve">Yes</w:t>
+            </w:r>
+          </w:p>
+        </w:tc>
+        <w:tc>
+          <w:tcPr>
+            <w:tcW w:type="dxa" w:w="2340"/>
             <w:tcBorders>
               <w:top w:val="single" w:color="CCCCCC" w:sz="1"/>
               <w:left w:val="single" w:color="CCCCCC" w:sz="1"/>
@@ -281,7 +281,7 @@
       <w:tr>
         <w:tc>
           <w:tcPr>
-            <w:tcW w:type="pct" w:w="22%"/>
+            <w:tcW w:type="dxa" w:w="2340"/>
             <w:tcBorders>
               <w:top w:val="single" w:color="CCCCCC" w:sz="1"/>
               <w:left w:val="single" w:color="CCCCCC" w:sz="1"/>
@@ -303,51 +303,51 @@
         </w:tc>
         <w:tc>
           <w:tcPr>
-            <w:tcW w:type="pct" w:w="22%"/>
-            <w:tcBorders>
-              <w:top w:val="single" w:color="CCCCCC" w:sz="1"/>
-              <w:left w:val="single" w:color="CCCCCC" w:sz="1"/>
-              <w:bottom w:val="single" w:color="CCCCCC" w:sz="1"/>
-              <w:right w:val="single" w:color="CCCCCC" w:sz="1"/>
-            </w:tcBorders>
-          </w:tcPr>
-          <w:p>
-            <w:r>
-              <w:rPr>
-                <w:b w:val="false"/>
-                <w:bCs w:val="false"/>
-                <w:sz w:val="20"/>
-                <w:szCs w:val="20"/>
-              </w:rPr>
-              <w:t xml:space="preserve">Yes</w:t>
-            </w:r>
-          </w:p>
-        </w:tc>
-        <w:tc>
-          <w:tcPr>
-            <w:tcW w:type="pct" w:w="22%"/>
-            <w:tcBorders>
-              <w:top w:val="single" w:color="CCCCCC" w:sz="1"/>
-              <w:left w:val="single" w:color="CCCCCC" w:sz="1"/>
-              <w:bottom w:val="single" w:color="CCCCCC" w:sz="1"/>
-              <w:right w:val="single" w:color="CCCCCC" w:sz="1"/>
-            </w:tcBorders>
-          </w:tcPr>
-          <w:p>
-            <w:r>
-              <w:rPr>
-                <w:b w:val="false"/>
-                <w:bCs w:val="false"/>
-                <w:sz w:val="20"/>
-                <w:szCs w:val="20"/>
-              </w:rPr>
-              <w:t xml:space="preserve">Yes</w:t>
-            </w:r>
-          </w:p>
-        </w:tc>
-        <w:tc>
-          <w:tcPr>
-            <w:tcW w:type="pct" w:w="22%"/>
+            <w:tcW w:type="dxa" w:w="2340"/>
+            <w:tcBorders>
+              <w:top w:val="single" w:color="CCCCCC" w:sz="1"/>
+              <w:left w:val="single" w:color="CCCCCC" w:sz="1"/>
+              <w:bottom w:val="single" w:color="CCCCCC" w:sz="1"/>
+              <w:right w:val="single" w:color="CCCCCC" w:sz="1"/>
+            </w:tcBorders>
+          </w:tcPr>
+          <w:p>
+            <w:r>
+              <w:rPr>
+                <w:b w:val="false"/>
+                <w:bCs w:val="false"/>
+                <w:sz w:val="20"/>
+                <w:szCs w:val="20"/>
+              </w:rPr>
+              <w:t xml:space="preserve">Yes</w:t>
+            </w:r>
+          </w:p>
+        </w:tc>
+        <w:tc>
+          <w:tcPr>
+            <w:tcW w:type="dxa" w:w="2340"/>
+            <w:tcBorders>
+              <w:top w:val="single" w:color="CCCCCC" w:sz="1"/>
+              <w:left w:val="single" w:color="CCCCCC" w:sz="1"/>
+              <w:bottom w:val="single" w:color="CCCCCC" w:sz="1"/>
+              <w:right w:val="single" w:color="CCCCCC" w:sz="1"/>
+            </w:tcBorders>
+          </w:tcPr>
+          <w:p>
+            <w:r>
+              <w:rPr>
+                <w:b w:val="false"/>
+                <w:bCs w:val="false"/>
+                <w:sz w:val="20"/>
+                <w:szCs w:val="20"/>
+              </w:rPr>
+              <w:t xml:space="preserve">Yes</w:t>
+            </w:r>
+          </w:p>
+        </w:tc>
+        <w:tc>
+          <w:tcPr>
+            <w:tcW w:type="dxa" w:w="2340"/>
             <w:tcBorders>
               <w:top w:val="single" w:color="CCCCCC" w:sz="1"/>
               <w:left w:val="single" w:color="CCCCCC" w:sz="1"/>
@@ -371,7 +371,7 @@
       <w:tr>
         <w:tc>
           <w:tcPr>
-            <w:tcW w:type="pct" w:w="22%"/>
+            <w:tcW w:type="dxa" w:w="2340"/>
             <w:tcBorders>
               <w:top w:val="single" w:color="CCCCCC" w:sz="1"/>
               <w:left w:val="single" w:color="CCCCCC" w:sz="1"/>
@@ -393,51 +393,51 @@
         </w:tc>
         <w:tc>
           <w:tcPr>
-            <w:tcW w:type="pct" w:w="22%"/>
-            <w:tcBorders>
-              <w:top w:val="single" w:color="CCCCCC" w:sz="1"/>
-              <w:left w:val="single" w:color="CCCCCC" w:sz="1"/>
-              <w:bottom w:val="single" w:color="CCCCCC" w:sz="1"/>
-              <w:right w:val="single" w:color="CCCCCC" w:sz="1"/>
-            </w:tcBorders>
-          </w:tcPr>
-          <w:p>
-            <w:r>
-              <w:rPr>
-                <w:b w:val="false"/>
-                <w:bCs w:val="false"/>
-                <w:sz w:val="20"/>
-                <w:szCs w:val="20"/>
-              </w:rPr>
-              <w:t xml:space="preserve">Yes</w:t>
-            </w:r>
-          </w:p>
-        </w:tc>
-        <w:tc>
-          <w:tcPr>
-            <w:tcW w:type="pct" w:w="22%"/>
-            <w:tcBorders>
-              <w:top w:val="single" w:color="CCCCCC" w:sz="1"/>
-              <w:left w:val="single" w:color="CCCCCC" w:sz="1"/>
-              <w:bottom w:val="single" w:color="CCCCCC" w:sz="1"/>
-              <w:right w:val="single" w:color="CCCCCC" w:sz="1"/>
-            </w:tcBorders>
-          </w:tcPr>
-          <w:p>
-            <w:r>
-              <w:rPr>
-                <w:b w:val="false"/>
-                <w:bCs w:val="false"/>
-                <w:sz w:val="20"/>
-                <w:szCs w:val="20"/>
-              </w:rPr>
-              <w:t xml:space="preserve">Yes</w:t>
-            </w:r>
-          </w:p>
-        </w:tc>
-        <w:tc>
-          <w:tcPr>
-            <w:tcW w:type="pct" w:w="22%"/>
+            <w:tcW w:type="dxa" w:w="2340"/>
+            <w:tcBorders>
+              <w:top w:val="single" w:color="CCCCCC" w:sz="1"/>
+              <w:left w:val="single" w:color="CCCCCC" w:sz="1"/>
+              <w:bottom w:val="single" w:color="CCCCCC" w:sz="1"/>
+              <w:right w:val="single" w:color="CCCCCC" w:sz="1"/>
+            </w:tcBorders>
+          </w:tcPr>
+          <w:p>
+            <w:r>
+              <w:rPr>
+                <w:b w:val="false"/>
+                <w:bCs w:val="false"/>
+                <w:sz w:val="20"/>
+                <w:szCs w:val="20"/>
+              </w:rPr>
+              <w:t xml:space="preserve">Yes</w:t>
+            </w:r>
+          </w:p>
+        </w:tc>
+        <w:tc>
+          <w:tcPr>
+            <w:tcW w:type="dxa" w:w="2340"/>
+            <w:tcBorders>
+              <w:top w:val="single" w:color="CCCCCC" w:sz="1"/>
+              <w:left w:val="single" w:color="CCCCCC" w:sz="1"/>
+              <w:bottom w:val="single" w:color="CCCCCC" w:sz="1"/>
+              <w:right w:val="single" w:color="CCCCCC" w:sz="1"/>
+            </w:tcBorders>
+          </w:tcPr>
+          <w:p>
+            <w:r>
+              <w:rPr>
+                <w:b w:val="false"/>
+                <w:bCs w:val="false"/>
+                <w:sz w:val="20"/>
+                <w:szCs w:val="20"/>
+              </w:rPr>
+              <w:t xml:space="preserve">Yes</w:t>
+            </w:r>
+          </w:p>
+        </w:tc>
+        <w:tc>
+          <w:tcPr>
+            <w:tcW w:type="dxa" w:w="2340"/>
             <w:tcBorders>
               <w:top w:val="single" w:color="CCCCCC" w:sz="1"/>
               <w:left w:val="single" w:color="CCCCCC" w:sz="1"/>
@@ -461,7 +461,7 @@
       <w:tr>
         <w:tc>
           <w:tcPr>
-            <w:tcW w:type="pct" w:w="22%"/>
+            <w:tcW w:type="dxa" w:w="2340"/>
             <w:tcBorders>
               <w:top w:val="single" w:color="CCCCCC" w:sz="1"/>
               <w:left w:val="single" w:color="CCCCCC" w:sz="1"/>
@@ -483,51 +483,51 @@
         </w:tc>
         <w:tc>
           <w:tcPr>
-            <w:tcW w:type="pct" w:w="22%"/>
-            <w:tcBorders>
-              <w:top w:val="single" w:color="CCCCCC" w:sz="1"/>
-              <w:left w:val="single" w:color="CCCCCC" w:sz="1"/>
-              <w:bottom w:val="single" w:color="CCCCCC" w:sz="1"/>
-              <w:right w:val="single" w:color="CCCCCC" w:sz="1"/>
-            </w:tcBorders>
-          </w:tcPr>
-          <w:p>
-            <w:r>
-              <w:rPr>
-                <w:b w:val="false"/>
-                <w:bCs w:val="false"/>
-                <w:sz w:val="20"/>
-                <w:szCs w:val="20"/>
-              </w:rPr>
-              <w:t xml:space="preserve">Yes</w:t>
-            </w:r>
-          </w:p>
-        </w:tc>
-        <w:tc>
-          <w:tcPr>
-            <w:tcW w:type="pct" w:w="22%"/>
-            <w:tcBorders>
-              <w:top w:val="single" w:color="CCCCCC" w:sz="1"/>
-              <w:left w:val="single" w:color="CCCCCC" w:sz="1"/>
-              <w:bottom w:val="single" w:color="CCCCCC" w:sz="1"/>
-              <w:right w:val="single" w:color="CCCCCC" w:sz="1"/>
-            </w:tcBorders>
-          </w:tcPr>
-          <w:p>
-            <w:r>
-              <w:rPr>
-                <w:b w:val="false"/>
-                <w:bCs w:val="false"/>
-                <w:sz w:val="20"/>
-                <w:szCs w:val="20"/>
-              </w:rPr>
-              <w:t xml:space="preserve">Yes</w:t>
-            </w:r>
-          </w:p>
-        </w:tc>
-        <w:tc>
-          <w:tcPr>
-            <w:tcW w:type="pct" w:w="22%"/>
+            <w:tcW w:type="dxa" w:w="2340"/>
+            <w:tcBorders>
+              <w:top w:val="single" w:color="CCCCCC" w:sz="1"/>
+              <w:left w:val="single" w:color="CCCCCC" w:sz="1"/>
+              <w:bottom w:val="single" w:color="CCCCCC" w:sz="1"/>
+              <w:right w:val="single" w:color="CCCCCC" w:sz="1"/>
+            </w:tcBorders>
+          </w:tcPr>
+          <w:p>
+            <w:r>
+              <w:rPr>
+                <w:b w:val="false"/>
+                <w:bCs w:val="false"/>
+                <w:sz w:val="20"/>
+                <w:szCs w:val="20"/>
+              </w:rPr>
+              <w:t xml:space="preserve">Yes</w:t>
+            </w:r>
+          </w:p>
+        </w:tc>
+        <w:tc>
+          <w:tcPr>
+            <w:tcW w:type="dxa" w:w="2340"/>
+            <w:tcBorders>
+              <w:top w:val="single" w:color="CCCCCC" w:sz="1"/>
+              <w:left w:val="single" w:color="CCCCCC" w:sz="1"/>
+              <w:bottom w:val="single" w:color="CCCCCC" w:sz="1"/>
+              <w:right w:val="single" w:color="CCCCCC" w:sz="1"/>
+            </w:tcBorders>
+          </w:tcPr>
+          <w:p>
+            <w:r>
+              <w:rPr>
+                <w:b w:val="false"/>
+                <w:bCs w:val="false"/>
+                <w:sz w:val="20"/>
+                <w:szCs w:val="20"/>
+              </w:rPr>
+              <w:t xml:space="preserve">Yes</w:t>
+            </w:r>
+          </w:p>
+        </w:tc>
+        <w:tc>
+          <w:tcPr>
+            <w:tcW w:type="dxa" w:w="2340"/>
             <w:tcBorders>
               <w:top w:val="single" w:color="CCCCCC" w:sz="1"/>
               <w:left w:val="single" w:color="CCCCCC" w:sz="1"/>
@@ -551,7 +551,7 @@
       <w:tr>
         <w:tc>
           <w:tcPr>
-            <w:tcW w:type="pct" w:w="22%"/>
+            <w:tcW w:type="dxa" w:w="2340"/>
             <w:tcBorders>
               <w:top w:val="single" w:color="CCCCCC" w:sz="1"/>
               <w:left w:val="single" w:color="CCCCCC" w:sz="1"/>
@@ -573,51 +573,51 @@
         </w:tc>
         <w:tc>
           <w:tcPr>
-            <w:tcW w:type="pct" w:w="22%"/>
-            <w:tcBorders>
-              <w:top w:val="single" w:color="CCCCCC" w:sz="1"/>
-              <w:left w:val="single" w:color="CCCCCC" w:sz="1"/>
-              <w:bottom w:val="single" w:color="CCCCCC" w:sz="1"/>
-              <w:right w:val="single" w:color="CCCCCC" w:sz="1"/>
-            </w:tcBorders>
-          </w:tcPr>
-          <w:p>
-            <w:r>
-              <w:rPr>
-                <w:b w:val="false"/>
-                <w:bCs w:val="false"/>
-                <w:sz w:val="20"/>
-                <w:szCs w:val="20"/>
-              </w:rPr>
-              <w:t xml:space="preserve">Yes</w:t>
-            </w:r>
-          </w:p>
-        </w:tc>
-        <w:tc>
-          <w:tcPr>
-            <w:tcW w:type="pct" w:w="22%"/>
-            <w:tcBorders>
-              <w:top w:val="single" w:color="CCCCCC" w:sz="1"/>
-              <w:left w:val="single" w:color="CCCCCC" w:sz="1"/>
-              <w:bottom w:val="single" w:color="CCCCCC" w:sz="1"/>
-              <w:right w:val="single" w:color="CCCCCC" w:sz="1"/>
-            </w:tcBorders>
-          </w:tcPr>
-          <w:p>
-            <w:r>
-              <w:rPr>
-                <w:b w:val="false"/>
-                <w:bCs w:val="false"/>
-                <w:sz w:val="20"/>
-                <w:szCs w:val="20"/>
-              </w:rPr>
-              <w:t xml:space="preserve">Yes</w:t>
-            </w:r>
-          </w:p>
-        </w:tc>
-        <w:tc>
-          <w:tcPr>
-            <w:tcW w:type="pct" w:w="22%"/>
+            <w:tcW w:type="dxa" w:w="2340"/>
+            <w:tcBorders>
+              <w:top w:val="single" w:color="CCCCCC" w:sz="1"/>
+              <w:left w:val="single" w:color="CCCCCC" w:sz="1"/>
+              <w:bottom w:val="single" w:color="CCCCCC" w:sz="1"/>
+              <w:right w:val="single" w:color="CCCCCC" w:sz="1"/>
+            </w:tcBorders>
+          </w:tcPr>
+          <w:p>
+            <w:r>
+              <w:rPr>
+                <w:b w:val="false"/>
+                <w:bCs w:val="false"/>
+                <w:sz w:val="20"/>
+                <w:szCs w:val="20"/>
+              </w:rPr>
+              <w:t xml:space="preserve">Yes</w:t>
+            </w:r>
+          </w:p>
+        </w:tc>
+        <w:tc>
+          <w:tcPr>
+            <w:tcW w:type="dxa" w:w="2340"/>
+            <w:tcBorders>
+              <w:top w:val="single" w:color="CCCCCC" w:sz="1"/>
+              <w:left w:val="single" w:color="CCCCCC" w:sz="1"/>
+              <w:bottom w:val="single" w:color="CCCCCC" w:sz="1"/>
+              <w:right w:val="single" w:color="CCCCCC" w:sz="1"/>
+            </w:tcBorders>
+          </w:tcPr>
+          <w:p>
+            <w:r>
+              <w:rPr>
+                <w:b w:val="false"/>
+                <w:bCs w:val="false"/>
+                <w:sz w:val="20"/>
+                <w:szCs w:val="20"/>
+              </w:rPr>
+              <w:t xml:space="preserve">Yes</w:t>
+            </w:r>
+          </w:p>
+        </w:tc>
+        <w:tc>
+          <w:tcPr>
+            <w:tcW w:type="dxa" w:w="2340"/>
             <w:tcBorders>
               <w:top w:val="single" w:color="CCCCCC" w:sz="1"/>
               <w:left w:val="single" w:color="CCCCCC" w:sz="1"/>
@@ -641,7 +641,7 @@
       <w:tr>
         <w:tc>
           <w:tcPr>
-            <w:tcW w:type="pct" w:w="22%"/>
+            <w:tcW w:type="dxa" w:w="2340"/>
             <w:tcBorders>
               <w:top w:val="single" w:color="CCCCCC" w:sz="1"/>
               <w:left w:val="single" w:color="CCCCCC" w:sz="1"/>
@@ -663,7 +663,7 @@
         </w:tc>
         <w:tc>
           <w:tcPr>
-            <w:tcW w:type="pct" w:w="22%"/>
+            <w:tcW w:type="dxa" w:w="2340"/>
             <w:tcBorders>
               <w:top w:val="single" w:color="CCCCCC" w:sz="1"/>
               <w:left w:val="single" w:color="CCCCCC" w:sz="1"/>
@@ -685,7 +685,7 @@
         </w:tc>
         <w:tc>
           <w:tcPr>
-            <w:tcW w:type="pct" w:w="22%"/>
+            <w:tcW w:type="dxa" w:w="2340"/>
             <w:tcBorders>
               <w:top w:val="single" w:color="CCCCCC" w:sz="1"/>
               <w:left w:val="single" w:color="CCCCCC" w:sz="1"/>
@@ -707,7 +707,7 @@
         </w:tc>
         <w:tc>
           <w:tcPr>
-            <w:tcW w:type="pct" w:w="22%"/>
+            <w:tcW w:type="dxa" w:w="2340"/>
             <w:tcBorders>
               <w:top w:val="single" w:color="CCCCCC" w:sz="1"/>
               <w:left w:val="single" w:color="CCCCCC" w:sz="1"/>
@@ -731,7 +731,7 @@
       <w:tr>
         <w:tc>
           <w:tcPr>
-            <w:tcW w:type="pct" w:w="22%"/>
+            <w:tcW w:type="dxa" w:w="2340"/>
             <w:tcBorders>
               <w:top w:val="single" w:color="CCCCCC" w:sz="1"/>
               <w:left w:val="single" w:color="CCCCCC" w:sz="1"/>
@@ -753,51 +753,51 @@
         </w:tc>
         <w:tc>
           <w:tcPr>
-            <w:tcW w:type="pct" w:w="22%"/>
-            <w:tcBorders>
-              <w:top w:val="single" w:color="CCCCCC" w:sz="1"/>
-              <w:left w:val="single" w:color="CCCCCC" w:sz="1"/>
-              <w:bottom w:val="single" w:color="CCCCCC" w:sz="1"/>
-              <w:right w:val="single" w:color="CCCCCC" w:sz="1"/>
-            </w:tcBorders>
-          </w:tcPr>
-          <w:p>
-            <w:r>
-              <w:rPr>
-                <w:b w:val="false"/>
-                <w:bCs w:val="false"/>
-                <w:sz w:val="20"/>
-                <w:szCs w:val="20"/>
-              </w:rPr>
-              <w:t xml:space="preserve">Yes</w:t>
-            </w:r>
-          </w:p>
-        </w:tc>
-        <w:tc>
-          <w:tcPr>
-            <w:tcW w:type="pct" w:w="22%"/>
-            <w:tcBorders>
-              <w:top w:val="single" w:color="CCCCCC" w:sz="1"/>
-              <w:left w:val="single" w:color="CCCCCC" w:sz="1"/>
-              <w:bottom w:val="single" w:color="CCCCCC" w:sz="1"/>
-              <w:right w:val="single" w:color="CCCCCC" w:sz="1"/>
-            </w:tcBorders>
-          </w:tcPr>
-          <w:p>
-            <w:r>
-              <w:rPr>
-                <w:b w:val="false"/>
-                <w:bCs w:val="false"/>
-                <w:sz w:val="20"/>
-                <w:szCs w:val="20"/>
-              </w:rPr>
-              <w:t xml:space="preserve">Yes</w:t>
-            </w:r>
-          </w:p>
-        </w:tc>
-        <w:tc>
-          <w:tcPr>
-            <w:tcW w:type="pct" w:w="22%"/>
+            <w:tcW w:type="dxa" w:w="2340"/>
+            <w:tcBorders>
+              <w:top w:val="single" w:color="CCCCCC" w:sz="1"/>
+              <w:left w:val="single" w:color="CCCCCC" w:sz="1"/>
+              <w:bottom w:val="single" w:color="CCCCCC" w:sz="1"/>
+              <w:right w:val="single" w:color="CCCCCC" w:sz="1"/>
+            </w:tcBorders>
+          </w:tcPr>
+          <w:p>
+            <w:r>
+              <w:rPr>
+                <w:b w:val="false"/>
+                <w:bCs w:val="false"/>
+                <w:sz w:val="20"/>
+                <w:szCs w:val="20"/>
+              </w:rPr>
+              <w:t xml:space="preserve">Yes</w:t>
+            </w:r>
+          </w:p>
+        </w:tc>
+        <w:tc>
+          <w:tcPr>
+            <w:tcW w:type="dxa" w:w="2340"/>
+            <w:tcBorders>
+              <w:top w:val="single" w:color="CCCCCC" w:sz="1"/>
+              <w:left w:val="single" w:color="CCCCCC" w:sz="1"/>
+              <w:bottom w:val="single" w:color="CCCCCC" w:sz="1"/>
+              <w:right w:val="single" w:color="CCCCCC" w:sz="1"/>
+            </w:tcBorders>
+          </w:tcPr>
+          <w:p>
+            <w:r>
+              <w:rPr>
+                <w:b w:val="false"/>
+                <w:bCs w:val="false"/>
+                <w:sz w:val="20"/>
+                <w:szCs w:val="20"/>
+              </w:rPr>
+              <w:t xml:space="preserve">Yes</w:t>
+            </w:r>
+          </w:p>
+        </w:tc>
+        <w:tc>
+          <w:tcPr>
+            <w:tcW w:type="dxa" w:w="2340"/>
             <w:tcBorders>
               <w:top w:val="single" w:color="CCCCCC" w:sz="1"/>
               <w:left w:val="single" w:color="CCCCCC" w:sz="1"/>
@@ -821,7 +821,7 @@
       <w:tr>
         <w:tc>
           <w:tcPr>
-            <w:tcW w:type="pct" w:w="22%"/>
+            <w:tcW w:type="dxa" w:w="2340"/>
             <w:tcBorders>
               <w:top w:val="single" w:color="CCCCCC" w:sz="1"/>
               <w:left w:val="single" w:color="CCCCCC" w:sz="1"/>
@@ -843,51 +843,51 @@
         </w:tc>
         <w:tc>
           <w:tcPr>
-            <w:tcW w:type="pct" w:w="22%"/>
-            <w:tcBorders>
-              <w:top w:val="single" w:color="CCCCCC" w:sz="1"/>
-              <w:left w:val="single" w:color="CCCCCC" w:sz="1"/>
-              <w:bottom w:val="single" w:color="CCCCCC" w:sz="1"/>
-              <w:right w:val="single" w:color="CCCCCC" w:sz="1"/>
-            </w:tcBorders>
-          </w:tcPr>
-          <w:p>
-            <w:r>
-              <w:rPr>
-                <w:b w:val="false"/>
-                <w:bCs w:val="false"/>
-                <w:sz w:val="20"/>
-                <w:szCs w:val="20"/>
-              </w:rPr>
-              <w:t xml:space="preserve">Yes</w:t>
-            </w:r>
-          </w:p>
-        </w:tc>
-        <w:tc>
-          <w:tcPr>
-            <w:tcW w:type="pct" w:w="22%"/>
-            <w:tcBorders>
-              <w:top w:val="single" w:color="CCCCCC" w:sz="1"/>
-              <w:left w:val="single" w:color="CCCCCC" w:sz="1"/>
-              <w:bottom w:val="single" w:color="CCCCCC" w:sz="1"/>
-              <w:right w:val="single" w:color="CCCCCC" w:sz="1"/>
-            </w:tcBorders>
-          </w:tcPr>
-          <w:p>
-            <w:r>
-              <w:rPr>
-                <w:b w:val="false"/>
-                <w:bCs w:val="false"/>
-                <w:sz w:val="20"/>
-                <w:szCs w:val="20"/>
-              </w:rPr>
-              <w:t xml:space="preserve">Yes</w:t>
-            </w:r>
-          </w:p>
-        </w:tc>
-        <w:tc>
-          <w:tcPr>
-            <w:tcW w:type="pct" w:w="22%"/>
+            <w:tcW w:type="dxa" w:w="2340"/>
+            <w:tcBorders>
+              <w:top w:val="single" w:color="CCCCCC" w:sz="1"/>
+              <w:left w:val="single" w:color="CCCCCC" w:sz="1"/>
+              <w:bottom w:val="single" w:color="CCCCCC" w:sz="1"/>
+              <w:right w:val="single" w:color="CCCCCC" w:sz="1"/>
+            </w:tcBorders>
+          </w:tcPr>
+          <w:p>
+            <w:r>
+              <w:rPr>
+                <w:b w:val="false"/>
+                <w:bCs w:val="false"/>
+                <w:sz w:val="20"/>
+                <w:szCs w:val="20"/>
+              </w:rPr>
+              <w:t xml:space="preserve">Yes</w:t>
+            </w:r>
+          </w:p>
+        </w:tc>
+        <w:tc>
+          <w:tcPr>
+            <w:tcW w:type="dxa" w:w="2340"/>
+            <w:tcBorders>
+              <w:top w:val="single" w:color="CCCCCC" w:sz="1"/>
+              <w:left w:val="single" w:color="CCCCCC" w:sz="1"/>
+              <w:bottom w:val="single" w:color="CCCCCC" w:sz="1"/>
+              <w:right w:val="single" w:color="CCCCCC" w:sz="1"/>
+            </w:tcBorders>
+          </w:tcPr>
+          <w:p>
+            <w:r>
+              <w:rPr>
+                <w:b w:val="false"/>
+                <w:bCs w:val="false"/>
+                <w:sz w:val="20"/>
+                <w:szCs w:val="20"/>
+              </w:rPr>
+              <w:t xml:space="preserve">Yes</w:t>
+            </w:r>
+          </w:p>
+        </w:tc>
+        <w:tc>
+          <w:tcPr>
+            <w:tcW w:type="dxa" w:w="2340"/>
             <w:tcBorders>
               <w:top w:val="single" w:color="CCCCCC" w:sz="1"/>
               <w:left w:val="single" w:color="CCCCCC" w:sz="1"/>
@@ -911,7 +911,7 @@
       <w:tr>
         <w:tc>
           <w:tcPr>
-            <w:tcW w:type="pct" w:w="22%"/>
+            <w:tcW w:type="dxa" w:w="2340"/>
             <w:tcBorders>
               <w:top w:val="single" w:color="CCCCCC" w:sz="1"/>
               <w:left w:val="single" w:color="CCCCCC" w:sz="1"/>
@@ -933,7 +933,7 @@
         </w:tc>
         <w:tc>
           <w:tcPr>
-            <w:tcW w:type="pct" w:w="22%"/>
+            <w:tcW w:type="dxa" w:w="2340"/>
             <w:tcBorders>
               <w:top w:val="single" w:color="CCCCCC" w:sz="1"/>
               <w:left w:val="single" w:color="CCCCCC" w:sz="1"/>
@@ -955,7 +955,7 @@
         </w:tc>
         <w:tc>
           <w:tcPr>
-            <w:tcW w:type="pct" w:w="22%"/>
+            <w:tcW w:type="dxa" w:w="2340"/>
             <w:tcBorders>
               <w:top w:val="single" w:color="CCCCCC" w:sz="1"/>
               <w:left w:val="single" w:color="CCCCCC" w:sz="1"/>
@@ -977,7 +977,7 @@
         </w:tc>
         <w:tc>
           <w:tcPr>
-            <w:tcW w:type="pct" w:w="22%"/>
+            <w:tcW w:type="dxa" w:w="2340"/>
             <w:tcBorders>
               <w:top w:val="single" w:color="CCCCCC" w:sz="1"/>
               <w:left w:val="single" w:color="CCCCCC" w:sz="1"/>
@@ -1001,7 +1001,7 @@
       <w:tr>
         <w:tc>
           <w:tcPr>
-            <w:tcW w:type="pct" w:w="22%"/>
+            <w:tcW w:type="dxa" w:w="2340"/>
             <w:tcBorders>
               <w:top w:val="single" w:color="CCCCCC" w:sz="1"/>
               <w:left w:val="single" w:color="CCCCCC" w:sz="1"/>
@@ -1023,51 +1023,51 @@
         </w:tc>
         <w:tc>
           <w:tcPr>
-            <w:tcW w:type="pct" w:w="22%"/>
-            <w:tcBorders>
-              <w:top w:val="single" w:color="CCCCCC" w:sz="1"/>
-              <w:left w:val="single" w:color="CCCCCC" w:sz="1"/>
-              <w:bottom w:val="single" w:color="CCCCCC" w:sz="1"/>
-              <w:right w:val="single" w:color="CCCCCC" w:sz="1"/>
-            </w:tcBorders>
-          </w:tcPr>
-          <w:p>
-            <w:r>
-              <w:rPr>
-                <w:b w:val="false"/>
-                <w:bCs w:val="false"/>
-                <w:sz w:val="20"/>
-                <w:szCs w:val="20"/>
-              </w:rPr>
-              <w:t xml:space="preserve">Yes</w:t>
-            </w:r>
-          </w:p>
-        </w:tc>
-        <w:tc>
-          <w:tcPr>
-            <w:tcW w:type="pct" w:w="22%"/>
-            <w:tcBorders>
-              <w:top w:val="single" w:color="CCCCCC" w:sz="1"/>
-              <w:left w:val="single" w:color="CCCCCC" w:sz="1"/>
-              <w:bottom w:val="single" w:color="CCCCCC" w:sz="1"/>
-              <w:right w:val="single" w:color="CCCCCC" w:sz="1"/>
-            </w:tcBorders>
-          </w:tcPr>
-          <w:p>
-            <w:r>
-              <w:rPr>
-                <w:b w:val="false"/>
-                <w:bCs w:val="false"/>
-                <w:sz w:val="20"/>
-                <w:szCs w:val="20"/>
-              </w:rPr>
-              <w:t xml:space="preserve">Yes</w:t>
-            </w:r>
-          </w:p>
-        </w:tc>
-        <w:tc>
-          <w:tcPr>
-            <w:tcW w:type="pct" w:w="22%"/>
+            <w:tcW w:type="dxa" w:w="2340"/>
+            <w:tcBorders>
+              <w:top w:val="single" w:color="CCCCCC" w:sz="1"/>
+              <w:left w:val="single" w:color="CCCCCC" w:sz="1"/>
+              <w:bottom w:val="single" w:color="CCCCCC" w:sz="1"/>
+              <w:right w:val="single" w:color="CCCCCC" w:sz="1"/>
+            </w:tcBorders>
+          </w:tcPr>
+          <w:p>
+            <w:r>
+              <w:rPr>
+                <w:b w:val="false"/>
+                <w:bCs w:val="false"/>
+                <w:sz w:val="20"/>
+                <w:szCs w:val="20"/>
+              </w:rPr>
+              <w:t xml:space="preserve">Yes</w:t>
+            </w:r>
+          </w:p>
+        </w:tc>
+        <w:tc>
+          <w:tcPr>
+            <w:tcW w:type="dxa" w:w="2340"/>
+            <w:tcBorders>
+              <w:top w:val="single" w:color="CCCCCC" w:sz="1"/>
+              <w:left w:val="single" w:color="CCCCCC" w:sz="1"/>
+              <w:bottom w:val="single" w:color="CCCCCC" w:sz="1"/>
+              <w:right w:val="single" w:color="CCCCCC" w:sz="1"/>
+            </w:tcBorders>
+          </w:tcPr>
+          <w:p>
+            <w:r>
+              <w:rPr>
+                <w:b w:val="false"/>
+                <w:bCs w:val="false"/>
+                <w:sz w:val="20"/>
+                <w:szCs w:val="20"/>
+              </w:rPr>
+              <w:t xml:space="preserve">Yes</w:t>
+            </w:r>
+          </w:p>
+        </w:tc>
+        <w:tc>
+          <w:tcPr>
+            <w:tcW w:type="dxa" w:w="2340"/>
             <w:tcBorders>
               <w:top w:val="single" w:color="CCCCCC" w:sz="1"/>
               <w:left w:val="single" w:color="CCCCCC" w:sz="1"/>
@@ -1091,7 +1091,7 @@
       <w:tr>
         <w:tc>
           <w:tcPr>
-            <w:tcW w:type="pct" w:w="22%"/>
+            <w:tcW w:type="dxa" w:w="2340"/>
             <w:tcBorders>
               <w:top w:val="single" w:color="CCCCCC" w:sz="1"/>
               <w:left w:val="single" w:color="CCCCCC" w:sz="1"/>
@@ -1113,51 +1113,51 @@
         </w:tc>
         <w:tc>
           <w:tcPr>
-            <w:tcW w:type="pct" w:w="22%"/>
-            <w:tcBorders>
-              <w:top w:val="single" w:color="CCCCCC" w:sz="1"/>
-              <w:left w:val="single" w:color="CCCCCC" w:sz="1"/>
-              <w:bottom w:val="single" w:color="CCCCCC" w:sz="1"/>
-              <w:right w:val="single" w:color="CCCCCC" w:sz="1"/>
-            </w:tcBorders>
-          </w:tcPr>
-          <w:p>
-            <w:r>
-              <w:rPr>
-                <w:b w:val="false"/>
-                <w:bCs w:val="false"/>
-                <w:sz w:val="20"/>
-                <w:szCs w:val="20"/>
-              </w:rPr>
-              <w:t xml:space="preserve">Yes</w:t>
-            </w:r>
-          </w:p>
-        </w:tc>
-        <w:tc>
-          <w:tcPr>
-            <w:tcW w:type="pct" w:w="22%"/>
-            <w:tcBorders>
-              <w:top w:val="single" w:color="CCCCCC" w:sz="1"/>
-              <w:left w:val="single" w:color="CCCCCC" w:sz="1"/>
-              <w:bottom w:val="single" w:color="CCCCCC" w:sz="1"/>
-              <w:right w:val="single" w:color="CCCCCC" w:sz="1"/>
-            </w:tcBorders>
-          </w:tcPr>
-          <w:p>
-            <w:r>
-              <w:rPr>
-                <w:b w:val="false"/>
-                <w:bCs w:val="false"/>
-                <w:sz w:val="20"/>
-                <w:szCs w:val="20"/>
-              </w:rPr>
-              <w:t xml:space="preserve">Yes</w:t>
-            </w:r>
-          </w:p>
-        </w:tc>
-        <w:tc>
-          <w:tcPr>
-            <w:tcW w:type="pct" w:w="22%"/>
+            <w:tcW w:type="dxa" w:w="2340"/>
+            <w:tcBorders>
+              <w:top w:val="single" w:color="CCCCCC" w:sz="1"/>
+              <w:left w:val="single" w:color="CCCCCC" w:sz="1"/>
+              <w:bottom w:val="single" w:color="CCCCCC" w:sz="1"/>
+              <w:right w:val="single" w:color="CCCCCC" w:sz="1"/>
+            </w:tcBorders>
+          </w:tcPr>
+          <w:p>
+            <w:r>
+              <w:rPr>
+                <w:b w:val="false"/>
+                <w:bCs w:val="false"/>
+                <w:sz w:val="20"/>
+                <w:szCs w:val="20"/>
+              </w:rPr>
+              <w:t xml:space="preserve">Yes</w:t>
+            </w:r>
+          </w:p>
+        </w:tc>
+        <w:tc>
+          <w:tcPr>
+            <w:tcW w:type="dxa" w:w="2340"/>
+            <w:tcBorders>
+              <w:top w:val="single" w:color="CCCCCC" w:sz="1"/>
+              <w:left w:val="single" w:color="CCCCCC" w:sz="1"/>
+              <w:bottom w:val="single" w:color="CCCCCC" w:sz="1"/>
+              <w:right w:val="single" w:color="CCCCCC" w:sz="1"/>
+            </w:tcBorders>
+          </w:tcPr>
+          <w:p>
+            <w:r>
+              <w:rPr>
+                <w:b w:val="false"/>
+                <w:bCs w:val="false"/>
+                <w:sz w:val="20"/>
+                <w:szCs w:val="20"/>
+              </w:rPr>
+              <w:t xml:space="preserve">Yes</w:t>
+            </w:r>
+          </w:p>
+        </w:tc>
+        <w:tc>
+          <w:tcPr>
+            <w:tcW w:type="dxa" w:w="2340"/>
             <w:tcBorders>
               <w:top w:val="single" w:color="CCCCCC" w:sz="1"/>
               <w:left w:val="single" w:color="CCCCCC" w:sz="1"/>
@@ -1181,7 +1181,7 @@
       <w:tr>
         <w:tc>
           <w:tcPr>
-            <w:tcW w:type="pct" w:w="22%"/>
+            <w:tcW w:type="dxa" w:w="2340"/>
             <w:tcBorders>
               <w:top w:val="single" w:color="CCCCCC" w:sz="1"/>
               <w:left w:val="single" w:color="CCCCCC" w:sz="1"/>
@@ -1203,7 +1203,7 @@
         </w:tc>
         <w:tc>
           <w:tcPr>
-            <w:tcW w:type="pct" w:w="22%"/>
+            <w:tcW w:type="dxa" w:w="2340"/>
             <w:tcBorders>
               <w:top w:val="single" w:color="CCCCCC" w:sz="1"/>
               <w:left w:val="single" w:color="CCCCCC" w:sz="1"/>
@@ -1225,7 +1225,7 @@
         </w:tc>
         <w:tc>
           <w:tcPr>
-            <w:tcW w:type="pct" w:w="22%"/>
+            <w:tcW w:type="dxa" w:w="2340"/>
             <w:tcBorders>
               <w:top w:val="single" w:color="CCCCCC" w:sz="1"/>
               <w:left w:val="single" w:color="CCCCCC" w:sz="1"/>
@@ -1247,7 +1247,7 @@
         </w:tc>
         <w:tc>
           <w:tcPr>
-            <w:tcW w:type="pct" w:w="22%"/>
+            <w:tcW w:type="dxa" w:w="2340"/>
             <w:tcBorders>
               <w:top w:val="single" w:color="CCCCCC" w:sz="1"/>
               <w:left w:val="single" w:color="CCCCCC" w:sz="1"/>
@@ -1271,7 +1271,7 @@
       <w:tr>
         <w:tc>
           <w:tcPr>
-            <w:tcW w:type="pct" w:w="22%"/>
+            <w:tcW w:type="dxa" w:w="2340"/>
             <w:tcBorders>
               <w:top w:val="single" w:color="CCCCCC" w:sz="1"/>
               <w:left w:val="single" w:color="CCCCCC" w:sz="1"/>
@@ -1293,7 +1293,7 @@
         </w:tc>
         <w:tc>
           <w:tcPr>
-            <w:tcW w:type="pct" w:w="22%"/>
+            <w:tcW w:type="dxa" w:w="2340"/>
             <w:tcBorders>
               <w:top w:val="single" w:color="CCCCCC" w:sz="1"/>
               <w:left w:val="single" w:color="CCCCCC" w:sz="1"/>
@@ -1315,7 +1315,7 @@
         </w:tc>
         <w:tc>
           <w:tcPr>
-            <w:tcW w:type="pct" w:w="22%"/>
+            <w:tcW w:type="dxa" w:w="2340"/>
             <w:tcBorders>
               <w:top w:val="single" w:color="CCCCCC" w:sz="1"/>
               <w:left w:val="single" w:color="CCCCCC" w:sz="1"/>
@@ -1337,7 +1337,7 @@
         </w:tc>
         <w:tc>
           <w:tcPr>
-            <w:tcW w:type="pct" w:w="22%"/>
+            <w:tcW w:type="dxa" w:w="2340"/>
             <w:tcBorders>
               <w:top w:val="single" w:color="CCCCCC" w:sz="1"/>
               <w:left w:val="single" w:color="CCCCCC" w:sz="1"/>
@@ -1361,7 +1361,7 @@
       <w:tr>
         <w:tc>
           <w:tcPr>
-            <w:tcW w:type="pct" w:w="22%"/>
+            <w:tcW w:type="dxa" w:w="2340"/>
             <w:tcBorders>
               <w:top w:val="single" w:color="CCCCCC" w:sz="1"/>
               <w:left w:val="single" w:color="CCCCCC" w:sz="1"/>
@@ -1383,7 +1383,7 @@
         </w:tc>
         <w:tc>
           <w:tcPr>
-            <w:tcW w:type="pct" w:w="22%"/>
+            <w:tcW w:type="dxa" w:w="2340"/>
             <w:tcBorders>
               <w:top w:val="single" w:color="CCCCCC" w:sz="1"/>
               <w:left w:val="single" w:color="CCCCCC" w:sz="1"/>
@@ -1405,29 +1405,29 @@
         </w:tc>
         <w:tc>
           <w:tcPr>
-            <w:tcW w:type="pct" w:w="22%"/>
-            <w:tcBorders>
-              <w:top w:val="single" w:color="CCCCCC" w:sz="1"/>
-              <w:left w:val="single" w:color="CCCCCC" w:sz="1"/>
-              <w:bottom w:val="single" w:color="CCCCCC" w:sz="1"/>
-              <w:right w:val="single" w:color="CCCCCC" w:sz="1"/>
-            </w:tcBorders>
-          </w:tcPr>
-          <w:p>
-            <w:r>
-              <w:rPr>
-                <w:b w:val="false"/>
-                <w:bCs w:val="false"/>
-                <w:sz w:val="20"/>
-                <w:szCs w:val="20"/>
-              </w:rPr>
-              <w:t xml:space="preserve">Yes</w:t>
-            </w:r>
-          </w:p>
-        </w:tc>
-        <w:tc>
-          <w:tcPr>
-            <w:tcW w:type="pct" w:w="22%"/>
+            <w:tcW w:type="dxa" w:w="2340"/>
+            <w:tcBorders>
+              <w:top w:val="single" w:color="CCCCCC" w:sz="1"/>
+              <w:left w:val="single" w:color="CCCCCC" w:sz="1"/>
+              <w:bottom w:val="single" w:color="CCCCCC" w:sz="1"/>
+              <w:right w:val="single" w:color="CCCCCC" w:sz="1"/>
+            </w:tcBorders>
+          </w:tcPr>
+          <w:p>
+            <w:r>
+              <w:rPr>
+                <w:b w:val="false"/>
+                <w:bCs w:val="false"/>
+                <w:sz w:val="20"/>
+                <w:szCs w:val="20"/>
+              </w:rPr>
+              <w:t xml:space="preserve">Yes</w:t>
+            </w:r>
+          </w:p>
+        </w:tc>
+        <w:tc>
+          <w:tcPr>
+            <w:tcW w:type="dxa" w:w="2340"/>
             <w:tcBorders>
               <w:top w:val="single" w:color="CCCCCC" w:sz="1"/>
               <w:left w:val="single" w:color="CCCCCC" w:sz="1"/>
@@ -1451,7 +1451,7 @@
       <w:tr>
         <w:tc>
           <w:tcPr>
-            <w:tcW w:type="pct" w:w="22%"/>
+            <w:tcW w:type="dxa" w:w="2340"/>
             <w:tcBorders>
               <w:top w:val="single" w:color="CCCCCC" w:sz="1"/>
               <w:left w:val="single" w:color="CCCCCC" w:sz="1"/>
@@ -1473,7 +1473,7 @@
         </w:tc>
         <w:tc>
           <w:tcPr>
-            <w:tcW w:type="pct" w:w="22%"/>
+            <w:tcW w:type="dxa" w:w="2340"/>
             <w:tcBorders>
               <w:top w:val="single" w:color="CCCCCC" w:sz="1"/>
               <w:left w:val="single" w:color="CCCCCC" w:sz="1"/>
@@ -1495,7 +1495,7 @@
         </w:tc>
         <w:tc>
           <w:tcPr>
-            <w:tcW w:type="pct" w:w="22%"/>
+            <w:tcW w:type="dxa" w:w="2340"/>
             <w:tcBorders>
               <w:top w:val="single" w:color="CCCCCC" w:sz="1"/>
               <w:left w:val="single" w:color="CCCCCC" w:sz="1"/>
@@ -1517,7 +1517,7 @@
         </w:tc>
         <w:tc>
           <w:tcPr>
-            <w:tcW w:type="pct" w:w="22%"/>
+            <w:tcW w:type="dxa" w:w="2340"/>
             <w:tcBorders>
               <w:top w:val="single" w:color="CCCCCC" w:sz="1"/>
               <w:left w:val="single" w:color="CCCCCC" w:sz="1"/>
@@ -1541,7 +1541,7 @@
       <w:tr>
         <w:tc>
           <w:tcPr>
-            <w:tcW w:type="pct" w:w="22%"/>
+            <w:tcW w:type="dxa" w:w="2340"/>
             <w:tcBorders>
               <w:top w:val="single" w:color="CCCCCC" w:sz="1"/>
               <w:left w:val="single" w:color="CCCCCC" w:sz="1"/>
@@ -1563,51 +1563,51 @@
         </w:tc>
         <w:tc>
           <w:tcPr>
-            <w:tcW w:type="pct" w:w="22%"/>
-            <w:tcBorders>
-              <w:top w:val="single" w:color="CCCCCC" w:sz="1"/>
-              <w:left w:val="single" w:color="CCCCCC" w:sz="1"/>
-              <w:bottom w:val="single" w:color="CCCCCC" w:sz="1"/>
-              <w:right w:val="single" w:color="CCCCCC" w:sz="1"/>
-            </w:tcBorders>
-          </w:tcPr>
-          <w:p>
-            <w:r>
-              <w:rPr>
-                <w:b w:val="false"/>
-                <w:bCs w:val="false"/>
-                <w:sz w:val="20"/>
-                <w:szCs w:val="20"/>
-              </w:rPr>
-              <w:t xml:space="preserve">Yes</w:t>
-            </w:r>
-          </w:p>
-        </w:tc>
-        <w:tc>
-          <w:tcPr>
-            <w:tcW w:type="pct" w:w="22%"/>
-            <w:tcBorders>
-              <w:top w:val="single" w:color="CCCCCC" w:sz="1"/>
-              <w:left w:val="single" w:color="CCCCCC" w:sz="1"/>
-              <w:bottom w:val="single" w:color="CCCCCC" w:sz="1"/>
-              <w:right w:val="single" w:color="CCCCCC" w:sz="1"/>
-            </w:tcBorders>
-          </w:tcPr>
-          <w:p>
-            <w:r>
-              <w:rPr>
-                <w:b w:val="false"/>
-                <w:bCs w:val="false"/>
-                <w:sz w:val="20"/>
-                <w:szCs w:val="20"/>
-              </w:rPr>
-              <w:t xml:space="preserve">Yes</w:t>
-            </w:r>
-          </w:p>
-        </w:tc>
-        <w:tc>
-          <w:tcPr>
-            <w:tcW w:type="pct" w:w="22%"/>
+            <w:tcW w:type="dxa" w:w="2340"/>
+            <w:tcBorders>
+              <w:top w:val="single" w:color="CCCCCC" w:sz="1"/>
+              <w:left w:val="single" w:color="CCCCCC" w:sz="1"/>
+              <w:bottom w:val="single" w:color="CCCCCC" w:sz="1"/>
+              <w:right w:val="single" w:color="CCCCCC" w:sz="1"/>
+            </w:tcBorders>
+          </w:tcPr>
+          <w:p>
+            <w:r>
+              <w:rPr>
+                <w:b w:val="false"/>
+                <w:bCs w:val="false"/>
+                <w:sz w:val="20"/>
+                <w:szCs w:val="20"/>
+              </w:rPr>
+              <w:t xml:space="preserve">Yes</w:t>
+            </w:r>
+          </w:p>
+        </w:tc>
+        <w:tc>
+          <w:tcPr>
+            <w:tcW w:type="dxa" w:w="2340"/>
+            <w:tcBorders>
+              <w:top w:val="single" w:color="CCCCCC" w:sz="1"/>
+              <w:left w:val="single" w:color="CCCCCC" w:sz="1"/>
+              <w:bottom w:val="single" w:color="CCCCCC" w:sz="1"/>
+              <w:right w:val="single" w:color="CCCCCC" w:sz="1"/>
+            </w:tcBorders>
+          </w:tcPr>
+          <w:p>
+            <w:r>
+              <w:rPr>
+                <w:b w:val="false"/>
+                <w:bCs w:val="false"/>
+                <w:sz w:val="20"/>
+                <w:szCs w:val="20"/>
+              </w:rPr>
+              <w:t xml:space="preserve">Yes</w:t>
+            </w:r>
+          </w:p>
+        </w:tc>
+        <w:tc>
+          <w:tcPr>
+            <w:tcW w:type="dxa" w:w="2340"/>
             <w:tcBorders>
               <w:top w:val="single" w:color="CCCCCC" w:sz="1"/>
               <w:left w:val="single" w:color="CCCCCC" w:sz="1"/>
@@ -1631,7 +1631,7 @@
       <w:tr>
         <w:tc>
           <w:tcPr>
-            <w:tcW w:type="pct" w:w="22%"/>
+            <w:tcW w:type="dxa" w:w="2340"/>
             <w:tcBorders>
               <w:top w:val="single" w:color="CCCCCC" w:sz="1"/>
               <w:left w:val="single" w:color="CCCCCC" w:sz="1"/>
@@ -1653,7 +1653,7 @@
         </w:tc>
         <w:tc>
           <w:tcPr>
-            <w:tcW w:type="pct" w:w="22%"/>
+            <w:tcW w:type="dxa" w:w="2340"/>
             <w:tcBorders>
               <w:top w:val="single" w:color="CCCCCC" w:sz="1"/>
               <w:left w:val="single" w:color="CCCCCC" w:sz="1"/>
@@ -1675,7 +1675,7 @@
         </w:tc>
         <w:tc>
           <w:tcPr>
-            <w:tcW w:type="pct" w:w="22%"/>
+            <w:tcW w:type="dxa" w:w="2340"/>
             <w:tcBorders>
               <w:top w:val="single" w:color="CCCCCC" w:sz="1"/>
               <w:left w:val="single" w:color="CCCCCC" w:sz="1"/>
@@ -1697,7 +1697,7 @@
         </w:tc>
         <w:tc>
           <w:tcPr>
-            <w:tcW w:type="pct" w:w="22%"/>
+            <w:tcW w:type="dxa" w:w="2340"/>
             <w:tcBorders>
               <w:top w:val="single" w:color="CCCCCC" w:sz="1"/>
               <w:left w:val="single" w:color="CCCCCC" w:sz="1"/>
@@ -1721,7 +1721,7 @@
       <w:tr>
         <w:tc>
           <w:tcPr>
-            <w:tcW w:type="pct" w:w="22%"/>
+            <w:tcW w:type="dxa" w:w="2340"/>
             <w:tcBorders>
               <w:top w:val="single" w:color="CCCCCC" w:sz="1"/>
               <w:left w:val="single" w:color="CCCCCC" w:sz="1"/>
@@ -1743,51 +1743,51 @@
         </w:tc>
         <w:tc>
           <w:tcPr>
-            <w:tcW w:type="pct" w:w="22%"/>
-            <w:tcBorders>
-              <w:top w:val="single" w:color="CCCCCC" w:sz="1"/>
-              <w:left w:val="single" w:color="CCCCCC" w:sz="1"/>
-              <w:bottom w:val="single" w:color="CCCCCC" w:sz="1"/>
-              <w:right w:val="single" w:color="CCCCCC" w:sz="1"/>
-            </w:tcBorders>
-          </w:tcPr>
-          <w:p>
-            <w:r>
-              <w:rPr>
-                <w:b w:val="false"/>
-                <w:bCs w:val="false"/>
-                <w:sz w:val="20"/>
-                <w:szCs w:val="20"/>
-              </w:rPr>
-              <w:t xml:space="preserve">Yes</w:t>
-            </w:r>
-          </w:p>
-        </w:tc>
-        <w:tc>
-          <w:tcPr>
-            <w:tcW w:type="pct" w:w="22%"/>
-            <w:tcBorders>
-              <w:top w:val="single" w:color="CCCCCC" w:sz="1"/>
-              <w:left w:val="single" w:color="CCCCCC" w:sz="1"/>
-              <w:bottom w:val="single" w:color="CCCCCC" w:sz="1"/>
-              <w:right w:val="single" w:color="CCCCCC" w:sz="1"/>
-            </w:tcBorders>
-          </w:tcPr>
-          <w:p>
-            <w:r>
-              <w:rPr>
-                <w:b w:val="false"/>
-                <w:bCs w:val="false"/>
-                <w:sz w:val="20"/>
-                <w:szCs w:val="20"/>
-              </w:rPr>
-              <w:t xml:space="preserve">Yes</w:t>
-            </w:r>
-          </w:p>
-        </w:tc>
-        <w:tc>
-          <w:tcPr>
-            <w:tcW w:type="pct" w:w="22%"/>
+            <w:tcW w:type="dxa" w:w="2340"/>
+            <w:tcBorders>
+              <w:top w:val="single" w:color="CCCCCC" w:sz="1"/>
+              <w:left w:val="single" w:color="CCCCCC" w:sz="1"/>
+              <w:bottom w:val="single" w:color="CCCCCC" w:sz="1"/>
+              <w:right w:val="single" w:color="CCCCCC" w:sz="1"/>
+            </w:tcBorders>
+          </w:tcPr>
+          <w:p>
+            <w:r>
+              <w:rPr>
+                <w:b w:val="false"/>
+                <w:bCs w:val="false"/>
+                <w:sz w:val="20"/>
+                <w:szCs w:val="20"/>
+              </w:rPr>
+              <w:t xml:space="preserve">Yes</w:t>
+            </w:r>
+          </w:p>
+        </w:tc>
+        <w:tc>
+          <w:tcPr>
+            <w:tcW w:type="dxa" w:w="2340"/>
+            <w:tcBorders>
+              <w:top w:val="single" w:color="CCCCCC" w:sz="1"/>
+              <w:left w:val="single" w:color="CCCCCC" w:sz="1"/>
+              <w:bottom w:val="single" w:color="CCCCCC" w:sz="1"/>
+              <w:right w:val="single" w:color="CCCCCC" w:sz="1"/>
+            </w:tcBorders>
+          </w:tcPr>
+          <w:p>
+            <w:r>
+              <w:rPr>
+                <w:b w:val="false"/>
+                <w:bCs w:val="false"/>
+                <w:sz w:val="20"/>
+                <w:szCs w:val="20"/>
+              </w:rPr>
+              <w:t xml:space="preserve">Yes</w:t>
+            </w:r>
+          </w:p>
+        </w:tc>
+        <w:tc>
+          <w:tcPr>
+            <w:tcW w:type="dxa" w:w="2340"/>
             <w:tcBorders>
               <w:top w:val="single" w:color="CCCCCC" w:sz="1"/>
               <w:left w:val="single" w:color="CCCCCC" w:sz="1"/>
@@ -1811,7 +1811,7 @@
       <w:tr>
         <w:tc>
           <w:tcPr>
-            <w:tcW w:type="pct" w:w="22%"/>
+            <w:tcW w:type="dxa" w:w="2340"/>
             <w:tcBorders>
               <w:top w:val="single" w:color="CCCCCC" w:sz="1"/>
               <w:left w:val="single" w:color="CCCCCC" w:sz="1"/>
@@ -1833,7 +1833,7 @@
         </w:tc>
         <w:tc>
           <w:tcPr>
-            <w:tcW w:type="pct" w:w="22%"/>
+            <w:tcW w:type="dxa" w:w="2340"/>
             <w:tcBorders>
               <w:top w:val="single" w:color="CCCCCC" w:sz="1"/>
               <w:left w:val="single" w:color="CCCCCC" w:sz="1"/>
@@ -1855,7 +1855,7 @@
         </w:tc>
         <w:tc>
           <w:tcPr>
-            <w:tcW w:type="pct" w:w="22%"/>
+            <w:tcW w:type="dxa" w:w="2340"/>
             <w:tcBorders>
               <w:top w:val="single" w:color="CCCCCC" w:sz="1"/>
               <w:left w:val="single" w:color="CCCCCC" w:sz="1"/>
@@ -1877,7 +1877,7 @@
         </w:tc>
         <w:tc>
           <w:tcPr>
-            <w:tcW w:type="pct" w:w="22%"/>
+            <w:tcW w:type="dxa" w:w="2340"/>
             <w:tcBorders>
               <w:top w:val="single" w:color="CCCCCC" w:sz="1"/>
               <w:left w:val="single" w:color="CCCCCC" w:sz="1"/>

</xml_diff>